<commit_message>
Phase 1: Fix factual errors, model claims, service count, Twitter handle, and retired product names
</commit_message>
<xml_diff>
--- a/article-footer-plain.docx
+++ b/article-footer-plain.docx
@@ -338,7 +338,7 @@
           <w:spacing w:val="0"/>
           <w:sz w:val="30"/>
         </w:rPr>
-        <w:t>Technical Writing — deep, sourced, developer-grade long-form content</w:t>
+        <w:t>Technical Writing - deep, sourced, developer-grade long-form content</w:t>
       </w:r>
     </w:p>
     <w:p>
@@ -382,7 +382,7 @@
           <w:spacing w:val="0"/>
           <w:sz w:val="30"/>
         </w:rPr>
-        <w:t>Generative AI Consulting — building complex Generative AI systems with TDD</w:t>
+        <w:t>Generative AI Consulting - building complex Generative AI systems with TDD</w:t>
       </w:r>
     </w:p>
     <w:p>
@@ -426,7 +426,7 @@
           <w:spacing w:val="0"/>
           <w:sz w:val="30"/>
         </w:rPr>
-        <w:t>Quantum Consulting — building complex quantum computing systems with TDD</w:t>
+        <w:t>Quantum Consulting - building complex quantum computing systems with TDD</w:t>
       </w:r>
     </w:p>
     <w:p>
@@ -470,7 +470,7 @@
           <w:spacing w:val="0"/>
           <w:sz w:val="30"/>
         </w:rPr>
-        <w:t>Python AI Engineering — building custom AI applications, tools, and pipelines</w:t>
+        <w:t>Python AI Engineering - building custom AI applications, tools, and pipelines</w:t>
       </w:r>
     </w:p>
     <w:p>
@@ -514,7 +514,7 @@
           <w:spacing w:val="0"/>
           <w:sz w:val="30"/>
         </w:rPr>
-        <w:t>Rust Systems Engineering — building high-performance systems-level AI applications</w:t>
+        <w:t>Rust Systems Engineering - building high-performance systems-level AI applications</w:t>
       </w:r>
     </w:p>
     <w:p>

</xml_diff>